<commit_message>
01 sin control de tamaño; agrega lectura D, tabla del mínimo real y nuevo mapa de supuestos
Co-Authored-By: Claude Sonnet 5 <noreply@anthropic.com>
</commit_message>
<xml_diff>
--- a/4. RESULTADOS/01_descriptivos_y_contexto/Descriptivos/T01_salario_minimo.docx
+++ b/4. RESULTADOS/01_descriptivos_y_contexto/Descriptivos/T01_salario_minimo.docx
@@ -37,7 +37,10 @@
       <w:tblGrid>
         <w:gridCol w:w="961"/>
         <w:gridCol w:w="1695"/>
+        <w:gridCol w:w="1218"/>
         <w:gridCol w:w="2417"/>
+        <w:gridCol w:w="1756"/>
+        <w:gridCol w:w="2612"/>
       </w:tblGrid>
       <w:tr>
         <w:trPr>
@@ -205,7 +208,172 @@
                 <w:szCs w:val="22"/>
                 <w:color w:val="000000"/>
               </w:rPr>
+              <w:t xml:space="preserve">inflacion</w:t>
+            </w:r>
+          </w:p>
+        </w:tc>
+        <w:tc>
+          <w:tcPr>
+            <w:tcBorders>
+              <w:bottom w:val="single" w:sz="12" w:space="0" w:color="666666"/>
+              <w:top w:val="single" w:sz="12" w:space="0" w:color="666666"/>
+              <w:left w:val="none" w:sz="0" w:space="0" w:color="000000"/>
+              <w:right w:val="none" w:sz="0" w:space="0" w:color="000000"/>
+            </w:tcBorders>
+            <w:shd w:val="clear" w:color="auto" w:fill="FFFFFF"/>
+            <w:tcMar>
+              <w:top w:w="0" w:type="dxa"/>
+              <w:bottom w:w="0" w:type="dxa"/>
+              <w:left w:w="0" w:type="dxa"/>
+              <w:right w:w="0" w:type="dxa"/>
+            </w:tcMar>
+            <w:vAlign w:val="center"/>
+          </w:tcPr>
+          <w:p>
+            <w:pPr>
+              <w:pStyle w:val="Normal"/>
+              <w:jc w:val="right"/>
+              <w:pBdr>
+                <w:bottom w:val="none" w:sz="0" w:space="0" w:color="000000"/>
+                <w:top w:val="none" w:sz="0" w:space="0" w:color="000000"/>
+                <w:left w:val="none" w:sz="0" w:space="0" w:color="000000"/>
+                <w:right w:val="none" w:sz="0" w:space="0" w:color="000000"/>
+              </w:pBdr>
+              <w:spacing w:after="100" w:before="100" w:line="240"/>
+              <w:ind w:left="100" w:right="100" w:firstLine="0" w:firstLineChars="0"/>
+              <w:rPr>
+                <w:rFonts w:ascii="Arial" w:hAnsi="Arial" w:eastAsia="Arial" w:cs="Arial"/>
+                <w:i w:val="false"/>
+                <w:b w:val="false"/>
+                <w:u w:val="none"/>
+                <w:strike w:val="false"/>
+                <w:sz w:val="22"/>
+                <w:szCs w:val="22"/>
+                <w:color w:val="000000"/>
+              </w:rPr>
+            </w:pPr>
+            <w:r>
+              <w:rPr>
+                <w:rFonts w:ascii="Arial" w:hAnsi="Arial" w:eastAsia="Arial" w:cs="Arial"/>
+                <w:i w:val="false"/>
+                <w:b w:val="false"/>
+                <w:u w:val="none"/>
+                <w:strike w:val="false"/>
+                <w:sz w:val="22"/>
+                <w:szCs w:val="22"/>
+                <w:color w:val="000000"/>
+              </w:rPr>
               <w:t xml:space="preserve">aumento_porcentual</w:t>
+            </w:r>
+          </w:p>
+        </w:tc>
+        <w:tc>
+          <w:tcPr>
+            <w:tcBorders>
+              <w:bottom w:val="single" w:sz="12" w:space="0" w:color="666666"/>
+              <w:top w:val="single" w:sz="12" w:space="0" w:color="666666"/>
+              <w:left w:val="none" w:sz="0" w:space="0" w:color="000000"/>
+              <w:right w:val="none" w:sz="0" w:space="0" w:color="000000"/>
+            </w:tcBorders>
+            <w:shd w:val="clear" w:color="auto" w:fill="FFFFFF"/>
+            <w:tcMar>
+              <w:top w:w="0" w:type="dxa"/>
+              <w:bottom w:w="0" w:type="dxa"/>
+              <w:left w:w="0" w:type="dxa"/>
+              <w:right w:w="0" w:type="dxa"/>
+            </w:tcMar>
+            <w:vAlign w:val="center"/>
+          </w:tcPr>
+          <w:p>
+            <w:pPr>
+              <w:pStyle w:val="Normal"/>
+              <w:jc w:val="right"/>
+              <w:pBdr>
+                <w:bottom w:val="none" w:sz="0" w:space="0" w:color="000000"/>
+                <w:top w:val="none" w:sz="0" w:space="0" w:color="000000"/>
+                <w:left w:val="none" w:sz="0" w:space="0" w:color="000000"/>
+                <w:right w:val="none" w:sz="0" w:space="0" w:color="000000"/>
+              </w:pBdr>
+              <w:spacing w:after="100" w:before="100" w:line="240"/>
+              <w:ind w:left="100" w:right="100" w:firstLine="0" w:firstLineChars="0"/>
+              <w:rPr>
+                <w:rFonts w:ascii="Arial" w:hAnsi="Arial" w:eastAsia="Arial" w:cs="Arial"/>
+                <w:i w:val="false"/>
+                <w:b w:val="false"/>
+                <w:u w:val="none"/>
+                <w:strike w:val="false"/>
+                <w:sz w:val="22"/>
+                <w:szCs w:val="22"/>
+                <w:color w:val="000000"/>
+              </w:rPr>
+            </w:pPr>
+            <w:r>
+              <w:rPr>
+                <w:rFonts w:ascii="Arial" w:hAnsi="Arial" w:eastAsia="Arial" w:cs="Arial"/>
+                <w:i w:val="false"/>
+                <w:b w:val="false"/>
+                <w:u w:val="none"/>
+                <w:strike w:val="false"/>
+                <w:sz w:val="22"/>
+                <w:szCs w:val="22"/>
+                <w:color w:val="000000"/>
+              </w:rPr>
+              <w:t xml:space="preserve">aumento_real</w:t>
+            </w:r>
+          </w:p>
+        </w:tc>
+        <w:tc>
+          <w:tcPr>
+            <w:tcBorders>
+              <w:bottom w:val="single" w:sz="12" w:space="0" w:color="666666"/>
+              <w:top w:val="single" w:sz="12" w:space="0" w:color="666666"/>
+              <w:left w:val="none" w:sz="0" w:space="0" w:color="000000"/>
+              <w:right w:val="none" w:sz="0" w:space="0" w:color="000000"/>
+            </w:tcBorders>
+            <w:shd w:val="clear" w:color="auto" w:fill="FFFFFF"/>
+            <w:tcMar>
+              <w:top w:w="0" w:type="dxa"/>
+              <w:bottom w:w="0" w:type="dxa"/>
+              <w:left w:w="0" w:type="dxa"/>
+              <w:right w:w="0" w:type="dxa"/>
+            </w:tcMar>
+            <w:vAlign w:val="center"/>
+          </w:tcPr>
+          <w:p>
+            <w:pPr>
+              <w:pStyle w:val="Normal"/>
+              <w:jc w:val="right"/>
+              <w:pBdr>
+                <w:bottom w:val="none" w:sz="0" w:space="0" w:color="000000"/>
+                <w:top w:val="none" w:sz="0" w:space="0" w:color="000000"/>
+                <w:left w:val="none" w:sz="0" w:space="0" w:color="000000"/>
+                <w:right w:val="none" w:sz="0" w:space="0" w:color="000000"/>
+              </w:pBdr>
+              <w:spacing w:after="100" w:before="100" w:line="240"/>
+              <w:ind w:left="100" w:right="100" w:firstLine="0" w:firstLineChars="0"/>
+              <w:rPr>
+                <w:rFonts w:ascii="Arial" w:hAnsi="Arial" w:eastAsia="Arial" w:cs="Arial"/>
+                <w:i w:val="false"/>
+                <w:b w:val="false"/>
+                <w:u w:val="none"/>
+                <w:strike w:val="false"/>
+                <w:sz w:val="22"/>
+                <w:szCs w:val="22"/>
+                <w:color w:val="000000"/>
+              </w:rPr>
+            </w:pPr>
+            <w:r>
+              <w:rPr>
+                <w:rFonts w:ascii="Arial" w:hAnsi="Arial" w:eastAsia="Arial" w:cs="Arial"/>
+                <w:i w:val="false"/>
+                <w:b w:val="false"/>
+                <w:u w:val="none"/>
+                <w:strike w:val="false"/>
+                <w:sz w:val="22"/>
+                <w:szCs w:val="22"/>
+                <w:color w:val="000000"/>
+              </w:rPr>
+              <w:t xml:space="preserve">aumento_real_decreto</w:t>
             </w:r>
           </w:p>
         </w:tc>
@@ -375,7 +543,172 @@
                 <w:szCs w:val="22"/>
                 <w:color w:val="000000"/>
               </w:rPr>
-              <w:t xml:space="preserve"/>
+              <w:t xml:space="preserve">6.77</w:t>
+            </w:r>
+          </w:p>
+        </w:tc>
+        <w:tc>
+          <w:tcPr>
+            <w:tcBorders>
+              <w:bottom w:val="none" w:sz="0" w:space="0" w:color="000000"/>
+              <w:top w:val="single" w:sz="12" w:space="0" w:color="666666"/>
+              <w:left w:val="none" w:sz="0" w:space="0" w:color="000000"/>
+              <w:right w:val="none" w:sz="0" w:space="0" w:color="000000"/>
+            </w:tcBorders>
+            <w:shd w:val="clear" w:color="auto" w:fill="FFFFFF"/>
+            <w:tcMar>
+              <w:top w:w="0" w:type="dxa"/>
+              <w:bottom w:w="0" w:type="dxa"/>
+              <w:left w:w="0" w:type="dxa"/>
+              <w:right w:w="0" w:type="dxa"/>
+            </w:tcMar>
+            <w:vAlign w:val="center"/>
+          </w:tcPr>
+          <w:p>
+            <w:pPr>
+              <w:pStyle w:val="Normal"/>
+              <w:jc w:val="right"/>
+              <w:pBdr>
+                <w:bottom w:val="none" w:sz="0" w:space="0" w:color="000000"/>
+                <w:top w:val="none" w:sz="0" w:space="0" w:color="000000"/>
+                <w:left w:val="none" w:sz="0" w:space="0" w:color="000000"/>
+                <w:right w:val="none" w:sz="0" w:space="0" w:color="000000"/>
+              </w:pBdr>
+              <w:spacing w:after="100" w:before="100" w:line="240"/>
+              <w:ind w:left="100" w:right="100" w:firstLine="0" w:firstLineChars="0"/>
+              <w:rPr>
+                <w:rFonts w:ascii="Arial" w:hAnsi="Arial" w:eastAsia="Arial" w:cs="Arial"/>
+                <w:i w:val="false"/>
+                <w:b w:val="false"/>
+                <w:u w:val="none"/>
+                <w:strike w:val="false"/>
+                <w:sz w:val="22"/>
+                <w:szCs w:val="22"/>
+                <w:color w:val="000000"/>
+              </w:rPr>
+            </w:pPr>
+            <w:r>
+              <w:rPr>
+                <w:rFonts w:ascii="Arial" w:hAnsi="Arial" w:eastAsia="Arial" w:cs="Arial"/>
+                <w:i w:val="false"/>
+                <w:b w:val="false"/>
+                <w:u w:val="none"/>
+                <w:strike w:val="false"/>
+                <w:sz w:val="22"/>
+                <w:szCs w:val="22"/>
+                <w:color w:val="000000"/>
+              </w:rPr>
+              <w:t xml:space="preserve">4.60</w:t>
+            </w:r>
+          </w:p>
+        </w:tc>
+        <w:tc>
+          <w:tcPr>
+            <w:tcBorders>
+              <w:bottom w:val="none" w:sz="0" w:space="0" w:color="000000"/>
+              <w:top w:val="single" w:sz="12" w:space="0" w:color="666666"/>
+              <w:left w:val="none" w:sz="0" w:space="0" w:color="000000"/>
+              <w:right w:val="none" w:sz="0" w:space="0" w:color="000000"/>
+            </w:tcBorders>
+            <w:shd w:val="clear" w:color="auto" w:fill="FFFFFF"/>
+            <w:tcMar>
+              <w:top w:w="0" w:type="dxa"/>
+              <w:bottom w:w="0" w:type="dxa"/>
+              <w:left w:w="0" w:type="dxa"/>
+              <w:right w:w="0" w:type="dxa"/>
+            </w:tcMar>
+            <w:vAlign w:val="center"/>
+          </w:tcPr>
+          <w:p>
+            <w:pPr>
+              <w:pStyle w:val="Normal"/>
+              <w:jc w:val="right"/>
+              <w:pBdr>
+                <w:bottom w:val="none" w:sz="0" w:space="0" w:color="000000"/>
+                <w:top w:val="none" w:sz="0" w:space="0" w:color="000000"/>
+                <w:left w:val="none" w:sz="0" w:space="0" w:color="000000"/>
+                <w:right w:val="none" w:sz="0" w:space="0" w:color="000000"/>
+              </w:pBdr>
+              <w:spacing w:after="100" w:before="100" w:line="240"/>
+              <w:ind w:left="100" w:right="100" w:firstLine="0" w:firstLineChars="0"/>
+              <w:rPr>
+                <w:rFonts w:ascii="Arial" w:hAnsi="Arial" w:eastAsia="Arial" w:cs="Arial"/>
+                <w:i w:val="false"/>
+                <w:b w:val="false"/>
+                <w:u w:val="none"/>
+                <w:strike w:val="false"/>
+                <w:sz w:val="22"/>
+                <w:szCs w:val="22"/>
+                <w:color w:val="000000"/>
+              </w:rPr>
+            </w:pPr>
+            <w:r>
+              <w:rPr>
+                <w:rFonts w:ascii="Arial" w:hAnsi="Arial" w:eastAsia="Arial" w:cs="Arial"/>
+                <w:i w:val="false"/>
+                <w:b w:val="false"/>
+                <w:u w:val="none"/>
+                <w:strike w:val="false"/>
+                <w:sz w:val="22"/>
+                <w:szCs w:val="22"/>
+                <w:color w:val="000000"/>
+              </w:rPr>
+              <w:t xml:space="preserve">-2.03</w:t>
+            </w:r>
+          </w:p>
+        </w:tc>
+        <w:tc>
+          <w:tcPr>
+            <w:tcBorders>
+              <w:bottom w:val="none" w:sz="0" w:space="0" w:color="000000"/>
+              <w:top w:val="single" w:sz="12" w:space="0" w:color="666666"/>
+              <w:left w:val="none" w:sz="0" w:space="0" w:color="000000"/>
+              <w:right w:val="none" w:sz="0" w:space="0" w:color="000000"/>
+            </w:tcBorders>
+            <w:shd w:val="clear" w:color="auto" w:fill="FFFFFF"/>
+            <w:tcMar>
+              <w:top w:w="0" w:type="dxa"/>
+              <w:bottom w:w="0" w:type="dxa"/>
+              <w:left w:w="0" w:type="dxa"/>
+              <w:right w:w="0" w:type="dxa"/>
+            </w:tcMar>
+            <w:vAlign w:val="center"/>
+          </w:tcPr>
+          <w:p>
+            <w:pPr>
+              <w:pStyle w:val="Normal"/>
+              <w:jc w:val="right"/>
+              <w:pBdr>
+                <w:bottom w:val="none" w:sz="0" w:space="0" w:color="000000"/>
+                <w:top w:val="none" w:sz="0" w:space="0" w:color="000000"/>
+                <w:left w:val="none" w:sz="0" w:space="0" w:color="000000"/>
+                <w:right w:val="none" w:sz="0" w:space="0" w:color="000000"/>
+              </w:pBdr>
+              <w:spacing w:after="100" w:before="100" w:line="240"/>
+              <w:ind w:left="100" w:right="100" w:firstLine="0" w:firstLineChars="0"/>
+              <w:rPr>
+                <w:rFonts w:ascii="Arial" w:hAnsi="Arial" w:eastAsia="Arial" w:cs="Arial"/>
+                <w:i w:val="false"/>
+                <w:b w:val="false"/>
+                <w:u w:val="none"/>
+                <w:strike w:val="false"/>
+                <w:sz w:val="22"/>
+                <w:szCs w:val="22"/>
+                <w:color w:val="000000"/>
+              </w:rPr>
+            </w:pPr>
+            <w:r>
+              <w:rPr>
+                <w:rFonts w:ascii="Arial" w:hAnsi="Arial" w:eastAsia="Arial" w:cs="Arial"/>
+                <w:i w:val="false"/>
+                <w:b w:val="false"/>
+                <w:u w:val="none"/>
+                <w:strike w:val="false"/>
+                <w:sz w:val="22"/>
+                <w:szCs w:val="22"/>
+                <w:color w:val="000000"/>
+              </w:rPr>
+              <w:t xml:space="preserve">0.91</w:t>
             </w:r>
           </w:p>
         </w:tc>
@@ -545,7 +878,172 @@
                 <w:szCs w:val="22"/>
                 <w:color w:val="000000"/>
               </w:rPr>
+              <w:t xml:space="preserve">5.75</w:t>
+            </w:r>
+          </w:p>
+        </w:tc>
+        <w:tc>
+          <w:tcPr>
+            <w:tcBorders>
+              <w:bottom w:val="none" w:sz="0" w:space="0" w:color="000000"/>
+              <w:top w:val="none" w:sz="0" w:space="0" w:color="000000"/>
+              <w:left w:val="none" w:sz="0" w:space="0" w:color="000000"/>
+              <w:right w:val="none" w:sz="0" w:space="0" w:color="000000"/>
+            </w:tcBorders>
+            <w:shd w:val="clear" w:color="auto" w:fill="FFFFFF"/>
+            <w:tcMar>
+              <w:top w:w="0" w:type="dxa"/>
+              <w:bottom w:w="0" w:type="dxa"/>
+              <w:left w:w="0" w:type="dxa"/>
+              <w:right w:w="0" w:type="dxa"/>
+            </w:tcMar>
+            <w:vAlign w:val="center"/>
+          </w:tcPr>
+          <w:p>
+            <w:pPr>
+              <w:pStyle w:val="Normal"/>
+              <w:jc w:val="right"/>
+              <w:pBdr>
+                <w:bottom w:val="none" w:sz="0" w:space="0" w:color="000000"/>
+                <w:top w:val="none" w:sz="0" w:space="0" w:color="000000"/>
+                <w:left w:val="none" w:sz="0" w:space="0" w:color="000000"/>
+                <w:right w:val="none" w:sz="0" w:space="0" w:color="000000"/>
+              </w:pBdr>
+              <w:spacing w:after="100" w:before="100" w:line="240"/>
+              <w:ind w:left="100" w:right="100" w:firstLine="0" w:firstLineChars="0"/>
+              <w:rPr>
+                <w:rFonts w:ascii="Arial" w:hAnsi="Arial" w:eastAsia="Arial" w:cs="Arial"/>
+                <w:i w:val="false"/>
+                <w:b w:val="false"/>
+                <w:u w:val="none"/>
+                <w:strike w:val="false"/>
+                <w:sz w:val="22"/>
+                <w:szCs w:val="22"/>
+                <w:color w:val="000000"/>
+              </w:rPr>
+            </w:pPr>
+            <w:r>
+              <w:rPr>
+                <w:rFonts w:ascii="Arial" w:hAnsi="Arial" w:eastAsia="Arial" w:cs="Arial"/>
+                <w:i w:val="false"/>
+                <w:b w:val="false"/>
+                <w:u w:val="none"/>
+                <w:strike w:val="false"/>
+                <w:sz w:val="22"/>
+                <w:szCs w:val="22"/>
+                <w:color w:val="000000"/>
+              </w:rPr>
               <w:t xml:space="preserve">7.00</w:t>
+            </w:r>
+          </w:p>
+        </w:tc>
+        <w:tc>
+          <w:tcPr>
+            <w:tcBorders>
+              <w:bottom w:val="none" w:sz="0" w:space="0" w:color="000000"/>
+              <w:top w:val="none" w:sz="0" w:space="0" w:color="000000"/>
+              <w:left w:val="none" w:sz="0" w:space="0" w:color="000000"/>
+              <w:right w:val="none" w:sz="0" w:space="0" w:color="000000"/>
+            </w:tcBorders>
+            <w:shd w:val="clear" w:color="auto" w:fill="FFFFFF"/>
+            <w:tcMar>
+              <w:top w:w="0" w:type="dxa"/>
+              <w:bottom w:w="0" w:type="dxa"/>
+              <w:left w:w="0" w:type="dxa"/>
+              <w:right w:w="0" w:type="dxa"/>
+            </w:tcMar>
+            <w:vAlign w:val="center"/>
+          </w:tcPr>
+          <w:p>
+            <w:pPr>
+              <w:pStyle w:val="Normal"/>
+              <w:jc w:val="right"/>
+              <w:pBdr>
+                <w:bottom w:val="none" w:sz="0" w:space="0" w:color="000000"/>
+                <w:top w:val="none" w:sz="0" w:space="0" w:color="000000"/>
+                <w:left w:val="none" w:sz="0" w:space="0" w:color="000000"/>
+                <w:right w:val="none" w:sz="0" w:space="0" w:color="000000"/>
+              </w:pBdr>
+              <w:spacing w:after="100" w:before="100" w:line="240"/>
+              <w:ind w:left="100" w:right="100" w:firstLine="0" w:firstLineChars="0"/>
+              <w:rPr>
+                <w:rFonts w:ascii="Arial" w:hAnsi="Arial" w:eastAsia="Arial" w:cs="Arial"/>
+                <w:i w:val="false"/>
+                <w:b w:val="false"/>
+                <w:u w:val="none"/>
+                <w:strike w:val="false"/>
+                <w:sz w:val="22"/>
+                <w:szCs w:val="22"/>
+                <w:color w:val="000000"/>
+              </w:rPr>
+            </w:pPr>
+            <w:r>
+              <w:rPr>
+                <w:rFonts w:ascii="Arial" w:hAnsi="Arial" w:eastAsia="Arial" w:cs="Arial"/>
+                <w:i w:val="false"/>
+                <w:b w:val="false"/>
+                <w:u w:val="none"/>
+                <w:strike w:val="false"/>
+                <w:sz w:val="22"/>
+                <w:szCs w:val="22"/>
+                <w:color w:val="000000"/>
+              </w:rPr>
+              <w:t xml:space="preserve">1.18</w:t>
+            </w:r>
+          </w:p>
+        </w:tc>
+        <w:tc>
+          <w:tcPr>
+            <w:tcBorders>
+              <w:bottom w:val="none" w:sz="0" w:space="0" w:color="000000"/>
+              <w:top w:val="none" w:sz="0" w:space="0" w:color="000000"/>
+              <w:left w:val="none" w:sz="0" w:space="0" w:color="000000"/>
+              <w:right w:val="none" w:sz="0" w:space="0" w:color="000000"/>
+            </w:tcBorders>
+            <w:shd w:val="clear" w:color="auto" w:fill="FFFFFF"/>
+            <w:tcMar>
+              <w:top w:w="0" w:type="dxa"/>
+              <w:bottom w:w="0" w:type="dxa"/>
+              <w:left w:w="0" w:type="dxa"/>
+              <w:right w:w="0" w:type="dxa"/>
+            </w:tcMar>
+            <w:vAlign w:val="center"/>
+          </w:tcPr>
+          <w:p>
+            <w:pPr>
+              <w:pStyle w:val="Normal"/>
+              <w:jc w:val="right"/>
+              <w:pBdr>
+                <w:bottom w:val="none" w:sz="0" w:space="0" w:color="000000"/>
+                <w:top w:val="none" w:sz="0" w:space="0" w:color="000000"/>
+                <w:left w:val="none" w:sz="0" w:space="0" w:color="000000"/>
+                <w:right w:val="none" w:sz="0" w:space="0" w:color="000000"/>
+              </w:pBdr>
+              <w:spacing w:after="100" w:before="100" w:line="240"/>
+              <w:ind w:left="100" w:right="100" w:firstLine="0" w:firstLineChars="0"/>
+              <w:rPr>
+                <w:rFonts w:ascii="Arial" w:hAnsi="Arial" w:eastAsia="Arial" w:cs="Arial"/>
+                <w:i w:val="false"/>
+                <w:b w:val="false"/>
+                <w:u w:val="none"/>
+                <w:strike w:val="false"/>
+                <w:sz w:val="22"/>
+                <w:szCs w:val="22"/>
+                <w:color w:val="000000"/>
+              </w:rPr>
+            </w:pPr>
+            <w:r>
+              <w:rPr>
+                <w:rFonts w:ascii="Arial" w:hAnsi="Arial" w:eastAsia="Arial" w:cs="Arial"/>
+                <w:i w:val="false"/>
+                <w:b w:val="false"/>
+                <w:u w:val="none"/>
+                <w:strike w:val="false"/>
+                <w:sz w:val="22"/>
+                <w:szCs w:val="22"/>
+                <w:color w:val="000000"/>
+              </w:rPr>
+              <w:t xml:space="preserve">0.22</w:t>
             </w:r>
           </w:p>
         </w:tc>
@@ -715,7 +1213,172 @@
                 <w:szCs w:val="22"/>
                 <w:color w:val="000000"/>
               </w:rPr>
+              <w:t xml:space="preserve">4.09</w:t>
+            </w:r>
+          </w:p>
+        </w:tc>
+        <w:tc>
+          <w:tcPr>
+            <w:tcBorders>
+              <w:bottom w:val="none" w:sz="0" w:space="0" w:color="000000"/>
+              <w:top w:val="none" w:sz="0" w:space="0" w:color="000000"/>
+              <w:left w:val="none" w:sz="0" w:space="0" w:color="000000"/>
+              <w:right w:val="none" w:sz="0" w:space="0" w:color="000000"/>
+            </w:tcBorders>
+            <w:shd w:val="clear" w:color="auto" w:fill="FFFFFF"/>
+            <w:tcMar>
+              <w:top w:w="0" w:type="dxa"/>
+              <w:bottom w:w="0" w:type="dxa"/>
+              <w:left w:w="0" w:type="dxa"/>
+              <w:right w:w="0" w:type="dxa"/>
+            </w:tcMar>
+            <w:vAlign w:val="center"/>
+          </w:tcPr>
+          <w:p>
+            <w:pPr>
+              <w:pStyle w:val="Normal"/>
+              <w:jc w:val="right"/>
+              <w:pBdr>
+                <w:bottom w:val="none" w:sz="0" w:space="0" w:color="000000"/>
+                <w:top w:val="none" w:sz="0" w:space="0" w:color="000000"/>
+                <w:left w:val="none" w:sz="0" w:space="0" w:color="000000"/>
+                <w:right w:val="none" w:sz="0" w:space="0" w:color="000000"/>
+              </w:pBdr>
+              <w:spacing w:after="100" w:before="100" w:line="240"/>
+              <w:ind w:left="100" w:right="100" w:firstLine="0" w:firstLineChars="0"/>
+              <w:rPr>
+                <w:rFonts w:ascii="Arial" w:hAnsi="Arial" w:eastAsia="Arial" w:cs="Arial"/>
+                <w:i w:val="false"/>
+                <w:b w:val="false"/>
+                <w:u w:val="none"/>
+                <w:strike w:val="false"/>
+                <w:sz w:val="22"/>
+                <w:szCs w:val="22"/>
+                <w:color w:val="000000"/>
+              </w:rPr>
+            </w:pPr>
+            <w:r>
+              <w:rPr>
+                <w:rFonts w:ascii="Arial" w:hAnsi="Arial" w:eastAsia="Arial" w:cs="Arial"/>
+                <w:i w:val="false"/>
+                <w:b w:val="false"/>
+                <w:u w:val="none"/>
+                <w:strike w:val="false"/>
+                <w:sz w:val="22"/>
+                <w:szCs w:val="22"/>
+                <w:color w:val="000000"/>
+              </w:rPr>
               <w:t xml:space="preserve">7.00</w:t>
+            </w:r>
+          </w:p>
+        </w:tc>
+        <w:tc>
+          <w:tcPr>
+            <w:tcBorders>
+              <w:bottom w:val="none" w:sz="0" w:space="0" w:color="000000"/>
+              <w:top w:val="none" w:sz="0" w:space="0" w:color="000000"/>
+              <w:left w:val="none" w:sz="0" w:space="0" w:color="000000"/>
+              <w:right w:val="none" w:sz="0" w:space="0" w:color="000000"/>
+            </w:tcBorders>
+            <w:shd w:val="clear" w:color="auto" w:fill="FFFFFF"/>
+            <w:tcMar>
+              <w:top w:w="0" w:type="dxa"/>
+              <w:bottom w:w="0" w:type="dxa"/>
+              <w:left w:w="0" w:type="dxa"/>
+              <w:right w:w="0" w:type="dxa"/>
+            </w:tcMar>
+            <w:vAlign w:val="center"/>
+          </w:tcPr>
+          <w:p>
+            <w:pPr>
+              <w:pStyle w:val="Normal"/>
+              <w:jc w:val="right"/>
+              <w:pBdr>
+                <w:bottom w:val="none" w:sz="0" w:space="0" w:color="000000"/>
+                <w:top w:val="none" w:sz="0" w:space="0" w:color="000000"/>
+                <w:left w:val="none" w:sz="0" w:space="0" w:color="000000"/>
+                <w:right w:val="none" w:sz="0" w:space="0" w:color="000000"/>
+              </w:pBdr>
+              <w:spacing w:after="100" w:before="100" w:line="240"/>
+              <w:ind w:left="100" w:right="100" w:firstLine="0" w:firstLineChars="0"/>
+              <w:rPr>
+                <w:rFonts w:ascii="Arial" w:hAnsi="Arial" w:eastAsia="Arial" w:cs="Arial"/>
+                <w:i w:val="false"/>
+                <w:b w:val="false"/>
+                <w:u w:val="none"/>
+                <w:strike w:val="false"/>
+                <w:sz w:val="22"/>
+                <w:szCs w:val="22"/>
+                <w:color w:val="000000"/>
+              </w:rPr>
+            </w:pPr>
+            <w:r>
+              <w:rPr>
+                <w:rFonts w:ascii="Arial" w:hAnsi="Arial" w:eastAsia="Arial" w:cs="Arial"/>
+                <w:i w:val="false"/>
+                <w:b w:val="false"/>
+                <w:u w:val="none"/>
+                <w:strike w:val="false"/>
+                <w:sz w:val="22"/>
+                <w:szCs w:val="22"/>
+                <w:color w:val="000000"/>
+              </w:rPr>
+              <w:t xml:space="preserve">2.80</w:t>
+            </w:r>
+          </w:p>
+        </w:tc>
+        <w:tc>
+          <w:tcPr>
+            <w:tcBorders>
+              <w:bottom w:val="none" w:sz="0" w:space="0" w:color="000000"/>
+              <w:top w:val="none" w:sz="0" w:space="0" w:color="000000"/>
+              <w:left w:val="none" w:sz="0" w:space="0" w:color="000000"/>
+              <w:right w:val="none" w:sz="0" w:space="0" w:color="000000"/>
+            </w:tcBorders>
+            <w:shd w:val="clear" w:color="auto" w:fill="FFFFFF"/>
+            <w:tcMar>
+              <w:top w:w="0" w:type="dxa"/>
+              <w:bottom w:w="0" w:type="dxa"/>
+              <w:left w:w="0" w:type="dxa"/>
+              <w:right w:w="0" w:type="dxa"/>
+            </w:tcMar>
+            <w:vAlign w:val="center"/>
+          </w:tcPr>
+          <w:p>
+            <w:pPr>
+              <w:pStyle w:val="Normal"/>
+              <w:jc w:val="right"/>
+              <w:pBdr>
+                <w:bottom w:val="none" w:sz="0" w:space="0" w:color="000000"/>
+                <w:top w:val="none" w:sz="0" w:space="0" w:color="000000"/>
+                <w:left w:val="none" w:sz="0" w:space="0" w:color="000000"/>
+                <w:right w:val="none" w:sz="0" w:space="0" w:color="000000"/>
+              </w:pBdr>
+              <w:spacing w:after="100" w:before="100" w:line="240"/>
+              <w:ind w:left="100" w:right="100" w:firstLine="0" w:firstLineChars="0"/>
+              <w:rPr>
+                <w:rFonts w:ascii="Arial" w:hAnsi="Arial" w:eastAsia="Arial" w:cs="Arial"/>
+                <w:i w:val="false"/>
+                <w:b w:val="false"/>
+                <w:u w:val="none"/>
+                <w:strike w:val="false"/>
+                <w:sz w:val="22"/>
+                <w:szCs w:val="22"/>
+                <w:color w:val="000000"/>
+              </w:rPr>
+            </w:pPr>
+            <w:r>
+              <w:rPr>
+                <w:rFonts w:ascii="Arial" w:hAnsi="Arial" w:eastAsia="Arial" w:cs="Arial"/>
+                <w:i w:val="false"/>
+                <w:b w:val="false"/>
+                <w:u w:val="none"/>
+                <w:strike w:val="false"/>
+                <w:sz w:val="22"/>
+                <w:szCs w:val="22"/>
+                <w:color w:val="000000"/>
+              </w:rPr>
+              <w:t xml:space="preserve">1.18</w:t>
             </w:r>
           </w:p>
         </w:tc>
@@ -885,7 +1548,172 @@
                 <w:szCs w:val="22"/>
                 <w:color w:val="000000"/>
               </w:rPr>
+              <w:t xml:space="preserve">3.18</w:t>
+            </w:r>
+          </w:p>
+        </w:tc>
+        <w:tc>
+          <w:tcPr>
+            <w:tcBorders>
+              <w:bottom w:val="none" w:sz="0" w:space="0" w:color="000000"/>
+              <w:top w:val="none" w:sz="0" w:space="0" w:color="000000"/>
+              <w:left w:val="none" w:sz="0" w:space="0" w:color="000000"/>
+              <w:right w:val="none" w:sz="0" w:space="0" w:color="000000"/>
+            </w:tcBorders>
+            <w:shd w:val="clear" w:color="auto" w:fill="FFFFFF"/>
+            <w:tcMar>
+              <w:top w:w="0" w:type="dxa"/>
+              <w:bottom w:w="0" w:type="dxa"/>
+              <w:left w:w="0" w:type="dxa"/>
+              <w:right w:w="0" w:type="dxa"/>
+            </w:tcMar>
+            <w:vAlign w:val="center"/>
+          </w:tcPr>
+          <w:p>
+            <w:pPr>
+              <w:pStyle w:val="Normal"/>
+              <w:jc w:val="right"/>
+              <w:pBdr>
+                <w:bottom w:val="none" w:sz="0" w:space="0" w:color="000000"/>
+                <w:top w:val="none" w:sz="0" w:space="0" w:color="000000"/>
+                <w:left w:val="none" w:sz="0" w:space="0" w:color="000000"/>
+                <w:right w:val="none" w:sz="0" w:space="0" w:color="000000"/>
+              </w:pBdr>
+              <w:spacing w:after="100" w:before="100" w:line="240"/>
+              <w:ind w:left="100" w:right="100" w:firstLine="0" w:firstLineChars="0"/>
+              <w:rPr>
+                <w:rFonts w:ascii="Arial" w:hAnsi="Arial" w:eastAsia="Arial" w:cs="Arial"/>
+                <w:i w:val="false"/>
+                <w:b w:val="false"/>
+                <w:u w:val="none"/>
+                <w:strike w:val="false"/>
+                <w:sz w:val="22"/>
+                <w:szCs w:val="22"/>
+                <w:color w:val="000000"/>
+              </w:rPr>
+            </w:pPr>
+            <w:r>
+              <w:rPr>
+                <w:rFonts w:ascii="Arial" w:hAnsi="Arial" w:eastAsia="Arial" w:cs="Arial"/>
+                <w:i w:val="false"/>
+                <w:b w:val="false"/>
+                <w:u w:val="none"/>
+                <w:strike w:val="false"/>
+                <w:sz w:val="22"/>
+                <w:szCs w:val="22"/>
+                <w:color w:val="000000"/>
+              </w:rPr>
               <w:t xml:space="preserve">5.90</w:t>
+            </w:r>
+          </w:p>
+        </w:tc>
+        <w:tc>
+          <w:tcPr>
+            <w:tcBorders>
+              <w:bottom w:val="none" w:sz="0" w:space="0" w:color="000000"/>
+              <w:top w:val="none" w:sz="0" w:space="0" w:color="000000"/>
+              <w:left w:val="none" w:sz="0" w:space="0" w:color="000000"/>
+              <w:right w:val="none" w:sz="0" w:space="0" w:color="000000"/>
+            </w:tcBorders>
+            <w:shd w:val="clear" w:color="auto" w:fill="FFFFFF"/>
+            <w:tcMar>
+              <w:top w:w="0" w:type="dxa"/>
+              <w:bottom w:w="0" w:type="dxa"/>
+              <w:left w:w="0" w:type="dxa"/>
+              <w:right w:w="0" w:type="dxa"/>
+            </w:tcMar>
+            <w:vAlign w:val="center"/>
+          </w:tcPr>
+          <w:p>
+            <w:pPr>
+              <w:pStyle w:val="Normal"/>
+              <w:jc w:val="right"/>
+              <w:pBdr>
+                <w:bottom w:val="none" w:sz="0" w:space="0" w:color="000000"/>
+                <w:top w:val="none" w:sz="0" w:space="0" w:color="000000"/>
+                <w:left w:val="none" w:sz="0" w:space="0" w:color="000000"/>
+                <w:right w:val="none" w:sz="0" w:space="0" w:color="000000"/>
+              </w:pBdr>
+              <w:spacing w:after="100" w:before="100" w:line="240"/>
+              <w:ind w:left="100" w:right="100" w:firstLine="0" w:firstLineChars="0"/>
+              <w:rPr>
+                <w:rFonts w:ascii="Arial" w:hAnsi="Arial" w:eastAsia="Arial" w:cs="Arial"/>
+                <w:i w:val="false"/>
+                <w:b w:val="false"/>
+                <w:u w:val="none"/>
+                <w:strike w:val="false"/>
+                <w:sz w:val="22"/>
+                <w:szCs w:val="22"/>
+                <w:color w:val="000000"/>
+              </w:rPr>
+            </w:pPr>
+            <w:r>
+              <w:rPr>
+                <w:rFonts w:ascii="Arial" w:hAnsi="Arial" w:eastAsia="Arial" w:cs="Arial"/>
+                <w:i w:val="false"/>
+                <w:b w:val="false"/>
+                <w:u w:val="none"/>
+                <w:strike w:val="false"/>
+                <w:sz w:val="22"/>
+                <w:szCs w:val="22"/>
+                <w:color w:val="000000"/>
+              </w:rPr>
+              <w:t xml:space="preserve">2.64</w:t>
+            </w:r>
+          </w:p>
+        </w:tc>
+        <w:tc>
+          <w:tcPr>
+            <w:tcBorders>
+              <w:bottom w:val="none" w:sz="0" w:space="0" w:color="000000"/>
+              <w:top w:val="none" w:sz="0" w:space="0" w:color="000000"/>
+              <w:left w:val="none" w:sz="0" w:space="0" w:color="000000"/>
+              <w:right w:val="none" w:sz="0" w:space="0" w:color="000000"/>
+            </w:tcBorders>
+            <w:shd w:val="clear" w:color="auto" w:fill="FFFFFF"/>
+            <w:tcMar>
+              <w:top w:w="0" w:type="dxa"/>
+              <w:bottom w:w="0" w:type="dxa"/>
+              <w:left w:w="0" w:type="dxa"/>
+              <w:right w:w="0" w:type="dxa"/>
+            </w:tcMar>
+            <w:vAlign w:val="center"/>
+          </w:tcPr>
+          <w:p>
+            <w:pPr>
+              <w:pStyle w:val="Normal"/>
+              <w:jc w:val="right"/>
+              <w:pBdr>
+                <w:bottom w:val="none" w:sz="0" w:space="0" w:color="000000"/>
+                <w:top w:val="none" w:sz="0" w:space="0" w:color="000000"/>
+                <w:left w:val="none" w:sz="0" w:space="0" w:color="000000"/>
+                <w:right w:val="none" w:sz="0" w:space="0" w:color="000000"/>
+              </w:pBdr>
+              <w:spacing w:after="100" w:before="100" w:line="240"/>
+              <w:ind w:left="100" w:right="100" w:firstLine="0" w:firstLineChars="0"/>
+              <w:rPr>
+                <w:rFonts w:ascii="Arial" w:hAnsi="Arial" w:eastAsia="Arial" w:cs="Arial"/>
+                <w:i w:val="false"/>
+                <w:b w:val="false"/>
+                <w:u w:val="none"/>
+                <w:strike w:val="false"/>
+                <w:sz w:val="22"/>
+                <w:szCs w:val="22"/>
+                <w:color w:val="000000"/>
+              </w:rPr>
+            </w:pPr>
+            <w:r>
+              <w:rPr>
+                <w:rFonts w:ascii="Arial" w:hAnsi="Arial" w:eastAsia="Arial" w:cs="Arial"/>
+                <w:i w:val="false"/>
+                <w:b w:val="false"/>
+                <w:u w:val="none"/>
+                <w:strike w:val="false"/>
+                <w:sz w:val="22"/>
+                <w:szCs w:val="22"/>
+                <w:color w:val="000000"/>
+              </w:rPr>
+              <w:t xml:space="preserve">1.74</w:t>
             </w:r>
           </w:p>
         </w:tc>
@@ -1055,7 +1883,172 @@
                 <w:szCs w:val="22"/>
                 <w:color w:val="000000"/>
               </w:rPr>
+              <w:t xml:space="preserve">3.80</w:t>
+            </w:r>
+          </w:p>
+        </w:tc>
+        <w:tc>
+          <w:tcPr>
+            <w:tcBorders>
+              <w:bottom w:val="none" w:sz="0" w:space="0" w:color="000000"/>
+              <w:top w:val="none" w:sz="0" w:space="0" w:color="000000"/>
+              <w:left w:val="none" w:sz="0" w:space="0" w:color="000000"/>
+              <w:right w:val="none" w:sz="0" w:space="0" w:color="000000"/>
+            </w:tcBorders>
+            <w:shd w:val="clear" w:color="auto" w:fill="FFFFFF"/>
+            <w:tcMar>
+              <w:top w:w="0" w:type="dxa"/>
+              <w:bottom w:w="0" w:type="dxa"/>
+              <w:left w:w="0" w:type="dxa"/>
+              <w:right w:w="0" w:type="dxa"/>
+            </w:tcMar>
+            <w:vAlign w:val="center"/>
+          </w:tcPr>
+          <w:p>
+            <w:pPr>
+              <w:pStyle w:val="Normal"/>
+              <w:jc w:val="right"/>
+              <w:pBdr>
+                <w:bottom w:val="none" w:sz="0" w:space="0" w:color="000000"/>
+                <w:top w:val="none" w:sz="0" w:space="0" w:color="000000"/>
+                <w:left w:val="none" w:sz="0" w:space="0" w:color="000000"/>
+                <w:right w:val="none" w:sz="0" w:space="0" w:color="000000"/>
+              </w:pBdr>
+              <w:spacing w:after="100" w:before="100" w:line="240"/>
+              <w:ind w:left="100" w:right="100" w:firstLine="0" w:firstLineChars="0"/>
+              <w:rPr>
+                <w:rFonts w:ascii="Arial" w:hAnsi="Arial" w:eastAsia="Arial" w:cs="Arial"/>
+                <w:i w:val="false"/>
+                <w:b w:val="false"/>
+                <w:u w:val="none"/>
+                <w:strike w:val="false"/>
+                <w:sz w:val="22"/>
+                <w:szCs w:val="22"/>
+                <w:color w:val="000000"/>
+              </w:rPr>
+            </w:pPr>
+            <w:r>
+              <w:rPr>
+                <w:rFonts w:ascii="Arial" w:hAnsi="Arial" w:eastAsia="Arial" w:cs="Arial"/>
+                <w:i w:val="false"/>
+                <w:b w:val="false"/>
+                <w:u w:val="none"/>
+                <w:strike w:val="false"/>
+                <w:sz w:val="22"/>
+                <w:szCs w:val="22"/>
+                <w:color w:val="000000"/>
+              </w:rPr>
               <w:t xml:space="preserve">6.00</w:t>
+            </w:r>
+          </w:p>
+        </w:tc>
+        <w:tc>
+          <w:tcPr>
+            <w:tcBorders>
+              <w:bottom w:val="none" w:sz="0" w:space="0" w:color="000000"/>
+              <w:top w:val="none" w:sz="0" w:space="0" w:color="000000"/>
+              <w:left w:val="none" w:sz="0" w:space="0" w:color="000000"/>
+              <w:right w:val="none" w:sz="0" w:space="0" w:color="000000"/>
+            </w:tcBorders>
+            <w:shd w:val="clear" w:color="auto" w:fill="FFFFFF"/>
+            <w:tcMar>
+              <w:top w:w="0" w:type="dxa"/>
+              <w:bottom w:w="0" w:type="dxa"/>
+              <w:left w:w="0" w:type="dxa"/>
+              <w:right w:w="0" w:type="dxa"/>
+            </w:tcMar>
+            <w:vAlign w:val="center"/>
+          </w:tcPr>
+          <w:p>
+            <w:pPr>
+              <w:pStyle w:val="Normal"/>
+              <w:jc w:val="right"/>
+              <w:pBdr>
+                <w:bottom w:val="none" w:sz="0" w:space="0" w:color="000000"/>
+                <w:top w:val="none" w:sz="0" w:space="0" w:color="000000"/>
+                <w:left w:val="none" w:sz="0" w:space="0" w:color="000000"/>
+                <w:right w:val="none" w:sz="0" w:space="0" w:color="000000"/>
+              </w:pBdr>
+              <w:spacing w:after="100" w:before="100" w:line="240"/>
+              <w:ind w:left="100" w:right="100" w:firstLine="0" w:firstLineChars="0"/>
+              <w:rPr>
+                <w:rFonts w:ascii="Arial" w:hAnsi="Arial" w:eastAsia="Arial" w:cs="Arial"/>
+                <w:i w:val="false"/>
+                <w:b w:val="false"/>
+                <w:u w:val="none"/>
+                <w:strike w:val="false"/>
+                <w:sz w:val="22"/>
+                <w:szCs w:val="22"/>
+                <w:color w:val="000000"/>
+              </w:rPr>
+            </w:pPr>
+            <w:r>
+              <w:rPr>
+                <w:rFonts w:ascii="Arial" w:hAnsi="Arial" w:eastAsia="Arial" w:cs="Arial"/>
+                <w:i w:val="false"/>
+                <w:b w:val="false"/>
+                <w:u w:val="none"/>
+                <w:strike w:val="false"/>
+                <w:sz w:val="22"/>
+                <w:szCs w:val="22"/>
+                <w:color w:val="000000"/>
+              </w:rPr>
+              <w:t xml:space="preserve">2.12</w:t>
+            </w:r>
+          </w:p>
+        </w:tc>
+        <w:tc>
+          <w:tcPr>
+            <w:tcBorders>
+              <w:bottom w:val="none" w:sz="0" w:space="0" w:color="000000"/>
+              <w:top w:val="none" w:sz="0" w:space="0" w:color="000000"/>
+              <w:left w:val="none" w:sz="0" w:space="0" w:color="000000"/>
+              <w:right w:val="none" w:sz="0" w:space="0" w:color="000000"/>
+            </w:tcBorders>
+            <w:shd w:val="clear" w:color="auto" w:fill="FFFFFF"/>
+            <w:tcMar>
+              <w:top w:w="0" w:type="dxa"/>
+              <w:bottom w:w="0" w:type="dxa"/>
+              <w:left w:w="0" w:type="dxa"/>
+              <w:right w:w="0" w:type="dxa"/>
+            </w:tcMar>
+            <w:vAlign w:val="center"/>
+          </w:tcPr>
+          <w:p>
+            <w:pPr>
+              <w:pStyle w:val="Normal"/>
+              <w:jc w:val="right"/>
+              <w:pBdr>
+                <w:bottom w:val="none" w:sz="0" w:space="0" w:color="000000"/>
+                <w:top w:val="none" w:sz="0" w:space="0" w:color="000000"/>
+                <w:left w:val="none" w:sz="0" w:space="0" w:color="000000"/>
+                <w:right w:val="none" w:sz="0" w:space="0" w:color="000000"/>
+              </w:pBdr>
+              <w:spacing w:after="100" w:before="100" w:line="240"/>
+              <w:ind w:left="100" w:right="100" w:firstLine="0" w:firstLineChars="0"/>
+              <w:rPr>
+                <w:rFonts w:ascii="Arial" w:hAnsi="Arial" w:eastAsia="Arial" w:cs="Arial"/>
+                <w:i w:val="false"/>
+                <w:b w:val="false"/>
+                <w:u w:val="none"/>
+                <w:strike w:val="false"/>
+                <w:sz w:val="22"/>
+                <w:szCs w:val="22"/>
+                <w:color w:val="000000"/>
+              </w:rPr>
+            </w:pPr>
+            <w:r>
+              <w:rPr>
+                <w:rFonts w:ascii="Arial" w:hAnsi="Arial" w:eastAsia="Arial" w:cs="Arial"/>
+                <w:i w:val="false"/>
+                <w:b w:val="false"/>
+                <w:u w:val="none"/>
+                <w:strike w:val="false"/>
+                <w:sz w:val="22"/>
+                <w:szCs w:val="22"/>
+                <w:color w:val="000000"/>
+              </w:rPr>
+              <w:t xml:space="preserve">2.73</w:t>
             </w:r>
           </w:p>
         </w:tc>
@@ -1225,7 +2218,172 @@
                 <w:szCs w:val="22"/>
                 <w:color w:val="000000"/>
               </w:rPr>
+              <w:t xml:space="preserve">1.61</w:t>
+            </w:r>
+          </w:p>
+        </w:tc>
+        <w:tc>
+          <w:tcPr>
+            <w:tcBorders>
+              <w:bottom w:val="none" w:sz="0" w:space="0" w:color="000000"/>
+              <w:top w:val="none" w:sz="0" w:space="0" w:color="000000"/>
+              <w:left w:val="none" w:sz="0" w:space="0" w:color="000000"/>
+              <w:right w:val="none" w:sz="0" w:space="0" w:color="000000"/>
+            </w:tcBorders>
+            <w:shd w:val="clear" w:color="auto" w:fill="FFFFFF"/>
+            <w:tcMar>
+              <w:top w:w="0" w:type="dxa"/>
+              <w:bottom w:w="0" w:type="dxa"/>
+              <w:left w:w="0" w:type="dxa"/>
+              <w:right w:w="0" w:type="dxa"/>
+            </w:tcMar>
+            <w:vAlign w:val="center"/>
+          </w:tcPr>
+          <w:p>
+            <w:pPr>
+              <w:pStyle w:val="Normal"/>
+              <w:jc w:val="right"/>
+              <w:pBdr>
+                <w:bottom w:val="none" w:sz="0" w:space="0" w:color="000000"/>
+                <w:top w:val="none" w:sz="0" w:space="0" w:color="000000"/>
+                <w:left w:val="none" w:sz="0" w:space="0" w:color="000000"/>
+                <w:right w:val="none" w:sz="0" w:space="0" w:color="000000"/>
+              </w:pBdr>
+              <w:spacing w:after="100" w:before="100" w:line="240"/>
+              <w:ind w:left="100" w:right="100" w:firstLine="0" w:firstLineChars="0"/>
+              <w:rPr>
+                <w:rFonts w:ascii="Arial" w:hAnsi="Arial" w:eastAsia="Arial" w:cs="Arial"/>
+                <w:i w:val="false"/>
+                <w:b w:val="false"/>
+                <w:u w:val="none"/>
+                <w:strike w:val="false"/>
+                <w:sz w:val="22"/>
+                <w:szCs w:val="22"/>
+                <w:color w:val="000000"/>
+              </w:rPr>
+            </w:pPr>
+            <w:r>
+              <w:rPr>
+                <w:rFonts w:ascii="Arial" w:hAnsi="Arial" w:eastAsia="Arial" w:cs="Arial"/>
+                <w:i w:val="false"/>
+                <w:b w:val="false"/>
+                <w:u w:val="none"/>
+                <w:strike w:val="false"/>
+                <w:sz w:val="22"/>
+                <w:szCs w:val="22"/>
+                <w:color w:val="000000"/>
+              </w:rPr>
               <w:t xml:space="preserve">6.00</w:t>
+            </w:r>
+          </w:p>
+        </w:tc>
+        <w:tc>
+          <w:tcPr>
+            <w:tcBorders>
+              <w:bottom w:val="none" w:sz="0" w:space="0" w:color="000000"/>
+              <w:top w:val="none" w:sz="0" w:space="0" w:color="000000"/>
+              <w:left w:val="none" w:sz="0" w:space="0" w:color="000000"/>
+              <w:right w:val="none" w:sz="0" w:space="0" w:color="000000"/>
+            </w:tcBorders>
+            <w:shd w:val="clear" w:color="auto" w:fill="FFFFFF"/>
+            <w:tcMar>
+              <w:top w:w="0" w:type="dxa"/>
+              <w:bottom w:w="0" w:type="dxa"/>
+              <w:left w:w="0" w:type="dxa"/>
+              <w:right w:w="0" w:type="dxa"/>
+            </w:tcMar>
+            <w:vAlign w:val="center"/>
+          </w:tcPr>
+          <w:p>
+            <w:pPr>
+              <w:pStyle w:val="Normal"/>
+              <w:jc w:val="right"/>
+              <w:pBdr>
+                <w:bottom w:val="none" w:sz="0" w:space="0" w:color="000000"/>
+                <w:top w:val="none" w:sz="0" w:space="0" w:color="000000"/>
+                <w:left w:val="none" w:sz="0" w:space="0" w:color="000000"/>
+                <w:right w:val="none" w:sz="0" w:space="0" w:color="000000"/>
+              </w:pBdr>
+              <w:spacing w:after="100" w:before="100" w:line="240"/>
+              <w:ind w:left="100" w:right="100" w:firstLine="0" w:firstLineChars="0"/>
+              <w:rPr>
+                <w:rFonts w:ascii="Arial" w:hAnsi="Arial" w:eastAsia="Arial" w:cs="Arial"/>
+                <w:i w:val="false"/>
+                <w:b w:val="false"/>
+                <w:u w:val="none"/>
+                <w:strike w:val="false"/>
+                <w:sz w:val="22"/>
+                <w:szCs w:val="22"/>
+                <w:color w:val="000000"/>
+              </w:rPr>
+            </w:pPr>
+            <w:r>
+              <w:rPr>
+                <w:rFonts w:ascii="Arial" w:hAnsi="Arial" w:eastAsia="Arial" w:cs="Arial"/>
+                <w:i w:val="false"/>
+                <w:b w:val="false"/>
+                <w:u w:val="none"/>
+                <w:strike w:val="false"/>
+                <w:sz w:val="22"/>
+                <w:szCs w:val="22"/>
+                <w:color w:val="000000"/>
+              </w:rPr>
+              <w:t xml:space="preserve">4.32</w:t>
+            </w:r>
+          </w:p>
+        </w:tc>
+        <w:tc>
+          <w:tcPr>
+            <w:tcBorders>
+              <w:bottom w:val="none" w:sz="0" w:space="0" w:color="000000"/>
+              <w:top w:val="none" w:sz="0" w:space="0" w:color="000000"/>
+              <w:left w:val="none" w:sz="0" w:space="0" w:color="000000"/>
+              <w:right w:val="none" w:sz="0" w:space="0" w:color="000000"/>
+            </w:tcBorders>
+            <w:shd w:val="clear" w:color="auto" w:fill="FFFFFF"/>
+            <w:tcMar>
+              <w:top w:w="0" w:type="dxa"/>
+              <w:bottom w:w="0" w:type="dxa"/>
+              <w:left w:w="0" w:type="dxa"/>
+              <w:right w:w="0" w:type="dxa"/>
+            </w:tcMar>
+            <w:vAlign w:val="center"/>
+          </w:tcPr>
+          <w:p>
+            <w:pPr>
+              <w:pStyle w:val="Normal"/>
+              <w:jc w:val="right"/>
+              <w:pBdr>
+                <w:bottom w:val="none" w:sz="0" w:space="0" w:color="000000"/>
+                <w:top w:val="none" w:sz="0" w:space="0" w:color="000000"/>
+                <w:left w:val="none" w:sz="0" w:space="0" w:color="000000"/>
+                <w:right w:val="none" w:sz="0" w:space="0" w:color="000000"/>
+              </w:pBdr>
+              <w:spacing w:after="100" w:before="100" w:line="240"/>
+              <w:ind w:left="100" w:right="100" w:firstLine="0" w:firstLineChars="0"/>
+              <w:rPr>
+                <w:rFonts w:ascii="Arial" w:hAnsi="Arial" w:eastAsia="Arial" w:cs="Arial"/>
+                <w:i w:val="false"/>
+                <w:b w:val="false"/>
+                <w:u w:val="none"/>
+                <w:strike w:val="false"/>
+                <w:sz w:val="22"/>
+                <w:szCs w:val="22"/>
+                <w:color w:val="000000"/>
+              </w:rPr>
+            </w:pPr>
+            <w:r>
+              <w:rPr>
+                <w:rFonts w:ascii="Arial" w:hAnsi="Arial" w:eastAsia="Arial" w:cs="Arial"/>
+                <w:i w:val="false"/>
+                <w:b w:val="false"/>
+                <w:u w:val="none"/>
+                <w:strike w:val="false"/>
+                <w:sz w:val="22"/>
+                <w:szCs w:val="22"/>
+                <w:color w:val="000000"/>
+              </w:rPr>
+              <w:t xml:space="preserve">2.12</w:t>
             </w:r>
           </w:p>
         </w:tc>
@@ -1395,7 +2553,172 @@
                 <w:szCs w:val="22"/>
                 <w:color w:val="000000"/>
               </w:rPr>
+              <w:t xml:space="preserve">5.62</w:t>
+            </w:r>
+          </w:p>
+        </w:tc>
+        <w:tc>
+          <w:tcPr>
+            <w:tcBorders>
+              <w:bottom w:val="none" w:sz="0" w:space="0" w:color="000000"/>
+              <w:top w:val="none" w:sz="0" w:space="0" w:color="000000"/>
+              <w:left w:val="none" w:sz="0" w:space="0" w:color="000000"/>
+              <w:right w:val="none" w:sz="0" w:space="0" w:color="000000"/>
+            </w:tcBorders>
+            <w:shd w:val="clear" w:color="auto" w:fill="FFFFFF"/>
+            <w:tcMar>
+              <w:top w:w="0" w:type="dxa"/>
+              <w:bottom w:w="0" w:type="dxa"/>
+              <w:left w:w="0" w:type="dxa"/>
+              <w:right w:w="0" w:type="dxa"/>
+            </w:tcMar>
+            <w:vAlign w:val="center"/>
+          </w:tcPr>
+          <w:p>
+            <w:pPr>
+              <w:pStyle w:val="Normal"/>
+              <w:jc w:val="right"/>
+              <w:pBdr>
+                <w:bottom w:val="none" w:sz="0" w:space="0" w:color="000000"/>
+                <w:top w:val="none" w:sz="0" w:space="0" w:color="000000"/>
+                <w:left w:val="none" w:sz="0" w:space="0" w:color="000000"/>
+                <w:right w:val="none" w:sz="0" w:space="0" w:color="000000"/>
+              </w:pBdr>
+              <w:spacing w:after="100" w:before="100" w:line="240"/>
+              <w:ind w:left="100" w:right="100" w:firstLine="0" w:firstLineChars="0"/>
+              <w:rPr>
+                <w:rFonts w:ascii="Arial" w:hAnsi="Arial" w:eastAsia="Arial" w:cs="Arial"/>
+                <w:i w:val="false"/>
+                <w:b w:val="false"/>
+                <w:u w:val="none"/>
+                <w:strike w:val="false"/>
+                <w:sz w:val="22"/>
+                <w:szCs w:val="22"/>
+                <w:color w:val="000000"/>
+              </w:rPr>
+            </w:pPr>
+            <w:r>
+              <w:rPr>
+                <w:rFonts w:ascii="Arial" w:hAnsi="Arial" w:eastAsia="Arial" w:cs="Arial"/>
+                <w:i w:val="false"/>
+                <w:b w:val="false"/>
+                <w:u w:val="none"/>
+                <w:strike w:val="false"/>
+                <w:sz w:val="22"/>
+                <w:szCs w:val="22"/>
+                <w:color w:val="000000"/>
+              </w:rPr>
               <w:t xml:space="preserve">3.50</w:t>
+            </w:r>
+          </w:p>
+        </w:tc>
+        <w:tc>
+          <w:tcPr>
+            <w:tcBorders>
+              <w:bottom w:val="none" w:sz="0" w:space="0" w:color="000000"/>
+              <w:top w:val="none" w:sz="0" w:space="0" w:color="000000"/>
+              <w:left w:val="none" w:sz="0" w:space="0" w:color="000000"/>
+              <w:right w:val="none" w:sz="0" w:space="0" w:color="000000"/>
+            </w:tcBorders>
+            <w:shd w:val="clear" w:color="auto" w:fill="FFFFFF"/>
+            <w:tcMar>
+              <w:top w:w="0" w:type="dxa"/>
+              <w:bottom w:w="0" w:type="dxa"/>
+              <w:left w:w="0" w:type="dxa"/>
+              <w:right w:w="0" w:type="dxa"/>
+            </w:tcMar>
+            <w:vAlign w:val="center"/>
+          </w:tcPr>
+          <w:p>
+            <w:pPr>
+              <w:pStyle w:val="Normal"/>
+              <w:jc w:val="right"/>
+              <w:pBdr>
+                <w:bottom w:val="none" w:sz="0" w:space="0" w:color="000000"/>
+                <w:top w:val="none" w:sz="0" w:space="0" w:color="000000"/>
+                <w:left w:val="none" w:sz="0" w:space="0" w:color="000000"/>
+                <w:right w:val="none" w:sz="0" w:space="0" w:color="000000"/>
+              </w:pBdr>
+              <w:spacing w:after="100" w:before="100" w:line="240"/>
+              <w:ind w:left="100" w:right="100" w:firstLine="0" w:firstLineChars="0"/>
+              <w:rPr>
+                <w:rFonts w:ascii="Arial" w:hAnsi="Arial" w:eastAsia="Arial" w:cs="Arial"/>
+                <w:i w:val="false"/>
+                <w:b w:val="false"/>
+                <w:u w:val="none"/>
+                <w:strike w:val="false"/>
+                <w:sz w:val="22"/>
+                <w:szCs w:val="22"/>
+                <w:color w:val="000000"/>
+              </w:rPr>
+            </w:pPr>
+            <w:r>
+              <w:rPr>
+                <w:rFonts w:ascii="Arial" w:hAnsi="Arial" w:eastAsia="Arial" w:cs="Arial"/>
+                <w:i w:val="false"/>
+                <w:b w:val="false"/>
+                <w:u w:val="none"/>
+                <w:strike w:val="false"/>
+                <w:sz w:val="22"/>
+                <w:szCs w:val="22"/>
+                <w:color w:val="000000"/>
+              </w:rPr>
+              <w:t xml:space="preserve">-2.01</w:t>
+            </w:r>
+          </w:p>
+        </w:tc>
+        <w:tc>
+          <w:tcPr>
+            <w:tcBorders>
+              <w:bottom w:val="none" w:sz="0" w:space="0" w:color="000000"/>
+              <w:top w:val="none" w:sz="0" w:space="0" w:color="000000"/>
+              <w:left w:val="none" w:sz="0" w:space="0" w:color="000000"/>
+              <w:right w:val="none" w:sz="0" w:space="0" w:color="000000"/>
+            </w:tcBorders>
+            <w:shd w:val="clear" w:color="auto" w:fill="FFFFFF"/>
+            <w:tcMar>
+              <w:top w:w="0" w:type="dxa"/>
+              <w:bottom w:w="0" w:type="dxa"/>
+              <w:left w:w="0" w:type="dxa"/>
+              <w:right w:w="0" w:type="dxa"/>
+            </w:tcMar>
+            <w:vAlign w:val="center"/>
+          </w:tcPr>
+          <w:p>
+            <w:pPr>
+              <w:pStyle w:val="Normal"/>
+              <w:jc w:val="right"/>
+              <w:pBdr>
+                <w:bottom w:val="none" w:sz="0" w:space="0" w:color="000000"/>
+                <w:top w:val="none" w:sz="0" w:space="0" w:color="000000"/>
+                <w:left w:val="none" w:sz="0" w:space="0" w:color="000000"/>
+                <w:right w:val="none" w:sz="0" w:space="0" w:color="000000"/>
+              </w:pBdr>
+              <w:spacing w:after="100" w:before="100" w:line="240"/>
+              <w:ind w:left="100" w:right="100" w:firstLine="0" w:firstLineChars="0"/>
+              <w:rPr>
+                <w:rFonts w:ascii="Arial" w:hAnsi="Arial" w:eastAsia="Arial" w:cs="Arial"/>
+                <w:i w:val="false"/>
+                <w:b w:val="false"/>
+                <w:u w:val="none"/>
+                <w:strike w:val="false"/>
+                <w:sz w:val="22"/>
+                <w:szCs w:val="22"/>
+                <w:color w:val="000000"/>
+              </w:rPr>
+            </w:pPr>
+            <w:r>
+              <w:rPr>
+                <w:rFonts w:ascii="Arial" w:hAnsi="Arial" w:eastAsia="Arial" w:cs="Arial"/>
+                <w:i w:val="false"/>
+                <w:b w:val="false"/>
+                <w:u w:val="none"/>
+                <w:strike w:val="false"/>
+                <w:sz w:val="22"/>
+                <w:szCs w:val="22"/>
+                <w:color w:val="000000"/>
+              </w:rPr>
+              <w:t xml:space="preserve">1.86</w:t>
             </w:r>
           </w:p>
         </w:tc>
@@ -1565,7 +2888,172 @@
                 <w:szCs w:val="22"/>
                 <w:color w:val="000000"/>
               </w:rPr>
+              <w:t xml:space="preserve">13.12</w:t>
+            </w:r>
+          </w:p>
+        </w:tc>
+        <w:tc>
+          <w:tcPr>
+            <w:tcBorders>
+              <w:bottom w:val="none" w:sz="0" w:space="0" w:color="000000"/>
+              <w:top w:val="none" w:sz="0" w:space="0" w:color="000000"/>
+              <w:left w:val="none" w:sz="0" w:space="0" w:color="000000"/>
+              <w:right w:val="none" w:sz="0" w:space="0" w:color="000000"/>
+            </w:tcBorders>
+            <w:shd w:val="clear" w:color="auto" w:fill="FFFFFF"/>
+            <w:tcMar>
+              <w:top w:w="0" w:type="dxa"/>
+              <w:bottom w:w="0" w:type="dxa"/>
+              <w:left w:w="0" w:type="dxa"/>
+              <w:right w:w="0" w:type="dxa"/>
+            </w:tcMar>
+            <w:vAlign w:val="center"/>
+          </w:tcPr>
+          <w:p>
+            <w:pPr>
+              <w:pStyle w:val="Normal"/>
+              <w:jc w:val="right"/>
+              <w:pBdr>
+                <w:bottom w:val="none" w:sz="0" w:space="0" w:color="000000"/>
+                <w:top w:val="none" w:sz="0" w:space="0" w:color="000000"/>
+                <w:left w:val="none" w:sz="0" w:space="0" w:color="000000"/>
+                <w:right w:val="none" w:sz="0" w:space="0" w:color="000000"/>
+              </w:pBdr>
+              <w:spacing w:after="100" w:before="100" w:line="240"/>
+              <w:ind w:left="100" w:right="100" w:firstLine="0" w:firstLineChars="0"/>
+              <w:rPr>
+                <w:rFonts w:ascii="Arial" w:hAnsi="Arial" w:eastAsia="Arial" w:cs="Arial"/>
+                <w:i w:val="false"/>
+                <w:b w:val="false"/>
+                <w:u w:val="none"/>
+                <w:strike w:val="false"/>
+                <w:sz w:val="22"/>
+                <w:szCs w:val="22"/>
+                <w:color w:val="000000"/>
+              </w:rPr>
+            </w:pPr>
+            <w:r>
+              <w:rPr>
+                <w:rFonts w:ascii="Arial" w:hAnsi="Arial" w:eastAsia="Arial" w:cs="Arial"/>
+                <w:i w:val="false"/>
+                <w:b w:val="false"/>
+                <w:u w:val="none"/>
+                <w:strike w:val="false"/>
+                <w:sz w:val="22"/>
+                <w:szCs w:val="22"/>
+                <w:color w:val="000000"/>
+              </w:rPr>
               <w:t xml:space="preserve">10.07</w:t>
+            </w:r>
+          </w:p>
+        </w:tc>
+        <w:tc>
+          <w:tcPr>
+            <w:tcBorders>
+              <w:bottom w:val="none" w:sz="0" w:space="0" w:color="000000"/>
+              <w:top w:val="none" w:sz="0" w:space="0" w:color="000000"/>
+              <w:left w:val="none" w:sz="0" w:space="0" w:color="000000"/>
+              <w:right w:val="none" w:sz="0" w:space="0" w:color="000000"/>
+            </w:tcBorders>
+            <w:shd w:val="clear" w:color="auto" w:fill="FFFFFF"/>
+            <w:tcMar>
+              <w:top w:w="0" w:type="dxa"/>
+              <w:bottom w:w="0" w:type="dxa"/>
+              <w:left w:w="0" w:type="dxa"/>
+              <w:right w:w="0" w:type="dxa"/>
+            </w:tcMar>
+            <w:vAlign w:val="center"/>
+          </w:tcPr>
+          <w:p>
+            <w:pPr>
+              <w:pStyle w:val="Normal"/>
+              <w:jc w:val="right"/>
+              <w:pBdr>
+                <w:bottom w:val="none" w:sz="0" w:space="0" w:color="000000"/>
+                <w:top w:val="none" w:sz="0" w:space="0" w:color="000000"/>
+                <w:left w:val="none" w:sz="0" w:space="0" w:color="000000"/>
+                <w:right w:val="none" w:sz="0" w:space="0" w:color="000000"/>
+              </w:pBdr>
+              <w:spacing w:after="100" w:before="100" w:line="240"/>
+              <w:ind w:left="100" w:right="100" w:firstLine="0" w:firstLineChars="0"/>
+              <w:rPr>
+                <w:rFonts w:ascii="Arial" w:hAnsi="Arial" w:eastAsia="Arial" w:cs="Arial"/>
+                <w:i w:val="false"/>
+                <w:b w:val="false"/>
+                <w:u w:val="none"/>
+                <w:strike w:val="false"/>
+                <w:sz w:val="22"/>
+                <w:szCs w:val="22"/>
+                <w:color w:val="000000"/>
+              </w:rPr>
+            </w:pPr>
+            <w:r>
+              <w:rPr>
+                <w:rFonts w:ascii="Arial" w:hAnsi="Arial" w:eastAsia="Arial" w:cs="Arial"/>
+                <w:i w:val="false"/>
+                <w:b w:val="false"/>
+                <w:u w:val="none"/>
+                <w:strike w:val="false"/>
+                <w:sz w:val="22"/>
+                <w:szCs w:val="22"/>
+                <w:color w:val="000000"/>
+              </w:rPr>
+              <w:t xml:space="preserve">-2.70</w:t>
+            </w:r>
+          </w:p>
+        </w:tc>
+        <w:tc>
+          <w:tcPr>
+            <w:tcBorders>
+              <w:bottom w:val="none" w:sz="0" w:space="0" w:color="000000"/>
+              <w:top w:val="none" w:sz="0" w:space="0" w:color="000000"/>
+              <w:left w:val="none" w:sz="0" w:space="0" w:color="000000"/>
+              <w:right w:val="none" w:sz="0" w:space="0" w:color="000000"/>
+            </w:tcBorders>
+            <w:shd w:val="clear" w:color="auto" w:fill="FFFFFF"/>
+            <w:tcMar>
+              <w:top w:w="0" w:type="dxa"/>
+              <w:bottom w:w="0" w:type="dxa"/>
+              <w:left w:w="0" w:type="dxa"/>
+              <w:right w:w="0" w:type="dxa"/>
+            </w:tcMar>
+            <w:vAlign w:val="center"/>
+          </w:tcPr>
+          <w:p>
+            <w:pPr>
+              <w:pStyle w:val="Normal"/>
+              <w:jc w:val="right"/>
+              <w:pBdr>
+                <w:bottom w:val="none" w:sz="0" w:space="0" w:color="000000"/>
+                <w:top w:val="none" w:sz="0" w:space="0" w:color="000000"/>
+                <w:left w:val="none" w:sz="0" w:space="0" w:color="000000"/>
+                <w:right w:val="none" w:sz="0" w:space="0" w:color="000000"/>
+              </w:pBdr>
+              <w:spacing w:after="100" w:before="100" w:line="240"/>
+              <w:ind w:left="100" w:right="100" w:firstLine="0" w:firstLineChars="0"/>
+              <w:rPr>
+                <w:rFonts w:ascii="Arial" w:hAnsi="Arial" w:eastAsia="Arial" w:cs="Arial"/>
+                <w:i w:val="false"/>
+                <w:b w:val="false"/>
+                <w:u w:val="none"/>
+                <w:strike w:val="false"/>
+                <w:sz w:val="22"/>
+                <w:szCs w:val="22"/>
+                <w:color w:val="000000"/>
+              </w:rPr>
+            </w:pPr>
+            <w:r>
+              <w:rPr>
+                <w:rFonts w:ascii="Arial" w:hAnsi="Arial" w:eastAsia="Arial" w:cs="Arial"/>
+                <w:i w:val="false"/>
+                <w:b w:val="false"/>
+                <w:u w:val="none"/>
+                <w:strike w:val="false"/>
+                <w:sz w:val="22"/>
+                <w:szCs w:val="22"/>
+                <w:color w:val="000000"/>
+              </w:rPr>
+              <w:t xml:space="preserve">4.21</w:t>
             </w:r>
           </w:p>
         </w:tc>
@@ -1735,7 +3223,172 @@
                 <w:szCs w:val="22"/>
                 <w:color w:val="000000"/>
               </w:rPr>
+              <w:t xml:space="preserve">9.28</w:t>
+            </w:r>
+          </w:p>
+        </w:tc>
+        <w:tc>
+          <w:tcPr>
+            <w:tcBorders>
+              <w:bottom w:val="none" w:sz="0" w:space="0" w:color="000000"/>
+              <w:top w:val="none" w:sz="0" w:space="0" w:color="000000"/>
+              <w:left w:val="none" w:sz="0" w:space="0" w:color="000000"/>
+              <w:right w:val="none" w:sz="0" w:space="0" w:color="000000"/>
+            </w:tcBorders>
+            <w:shd w:val="clear" w:color="auto" w:fill="FFFFFF"/>
+            <w:tcMar>
+              <w:top w:w="0" w:type="dxa"/>
+              <w:bottom w:w="0" w:type="dxa"/>
+              <w:left w:w="0" w:type="dxa"/>
+              <w:right w:w="0" w:type="dxa"/>
+            </w:tcMar>
+            <w:vAlign w:val="center"/>
+          </w:tcPr>
+          <w:p>
+            <w:pPr>
+              <w:pStyle w:val="Normal"/>
+              <w:jc w:val="right"/>
+              <w:pBdr>
+                <w:bottom w:val="none" w:sz="0" w:space="0" w:color="000000"/>
+                <w:top w:val="none" w:sz="0" w:space="0" w:color="000000"/>
+                <w:left w:val="none" w:sz="0" w:space="0" w:color="000000"/>
+                <w:right w:val="none" w:sz="0" w:space="0" w:color="000000"/>
+              </w:pBdr>
+              <w:spacing w:after="100" w:before="100" w:line="240"/>
+              <w:ind w:left="100" w:right="100" w:firstLine="0" w:firstLineChars="0"/>
+              <w:rPr>
+                <w:rFonts w:ascii="Arial" w:hAnsi="Arial" w:eastAsia="Arial" w:cs="Arial"/>
+                <w:i w:val="false"/>
+                <w:b w:val="false"/>
+                <w:u w:val="none"/>
+                <w:strike w:val="false"/>
+                <w:sz w:val="22"/>
+                <w:szCs w:val="22"/>
+                <w:color w:val="000000"/>
+              </w:rPr>
+            </w:pPr>
+            <w:r>
+              <w:rPr>
+                <w:rFonts w:ascii="Arial" w:hAnsi="Arial" w:eastAsia="Arial" w:cs="Arial"/>
+                <w:i w:val="false"/>
+                <w:b w:val="false"/>
+                <w:u w:val="none"/>
+                <w:strike w:val="false"/>
+                <w:sz w:val="22"/>
+                <w:szCs w:val="22"/>
+                <w:color w:val="000000"/>
+              </w:rPr>
               <w:t xml:space="preserve">16.00</w:t>
+            </w:r>
+          </w:p>
+        </w:tc>
+        <w:tc>
+          <w:tcPr>
+            <w:tcBorders>
+              <w:bottom w:val="none" w:sz="0" w:space="0" w:color="000000"/>
+              <w:top w:val="none" w:sz="0" w:space="0" w:color="000000"/>
+              <w:left w:val="none" w:sz="0" w:space="0" w:color="000000"/>
+              <w:right w:val="none" w:sz="0" w:space="0" w:color="000000"/>
+            </w:tcBorders>
+            <w:shd w:val="clear" w:color="auto" w:fill="FFFFFF"/>
+            <w:tcMar>
+              <w:top w:w="0" w:type="dxa"/>
+              <w:bottom w:w="0" w:type="dxa"/>
+              <w:left w:w="0" w:type="dxa"/>
+              <w:right w:w="0" w:type="dxa"/>
+            </w:tcMar>
+            <w:vAlign w:val="center"/>
+          </w:tcPr>
+          <w:p>
+            <w:pPr>
+              <w:pStyle w:val="Normal"/>
+              <w:jc w:val="right"/>
+              <w:pBdr>
+                <w:bottom w:val="none" w:sz="0" w:space="0" w:color="000000"/>
+                <w:top w:val="none" w:sz="0" w:space="0" w:color="000000"/>
+                <w:left w:val="none" w:sz="0" w:space="0" w:color="000000"/>
+                <w:right w:val="none" w:sz="0" w:space="0" w:color="000000"/>
+              </w:pBdr>
+              <w:spacing w:after="100" w:before="100" w:line="240"/>
+              <w:ind w:left="100" w:right="100" w:firstLine="0" w:firstLineChars="0"/>
+              <w:rPr>
+                <w:rFonts w:ascii="Arial" w:hAnsi="Arial" w:eastAsia="Arial" w:cs="Arial"/>
+                <w:i w:val="false"/>
+                <w:b w:val="false"/>
+                <w:u w:val="none"/>
+                <w:strike w:val="false"/>
+                <w:sz w:val="22"/>
+                <w:szCs w:val="22"/>
+                <w:color w:val="000000"/>
+              </w:rPr>
+            </w:pPr>
+            <w:r>
+              <w:rPr>
+                <w:rFonts w:ascii="Arial" w:hAnsi="Arial" w:eastAsia="Arial" w:cs="Arial"/>
+                <w:i w:val="false"/>
+                <w:b w:val="false"/>
+                <w:u w:val="none"/>
+                <w:strike w:val="false"/>
+                <w:sz w:val="22"/>
+                <w:szCs w:val="22"/>
+                <w:color w:val="000000"/>
+              </w:rPr>
+              <w:t xml:space="preserve">6.15</w:t>
+            </w:r>
+          </w:p>
+        </w:tc>
+        <w:tc>
+          <w:tcPr>
+            <w:tcBorders>
+              <w:bottom w:val="none" w:sz="0" w:space="0" w:color="000000"/>
+              <w:top w:val="none" w:sz="0" w:space="0" w:color="000000"/>
+              <w:left w:val="none" w:sz="0" w:space="0" w:color="000000"/>
+              <w:right w:val="none" w:sz="0" w:space="0" w:color="000000"/>
+            </w:tcBorders>
+            <w:shd w:val="clear" w:color="auto" w:fill="FFFFFF"/>
+            <w:tcMar>
+              <w:top w:w="0" w:type="dxa"/>
+              <w:bottom w:w="0" w:type="dxa"/>
+              <w:left w:w="0" w:type="dxa"/>
+              <w:right w:w="0" w:type="dxa"/>
+            </w:tcMar>
+            <w:vAlign w:val="center"/>
+          </w:tcPr>
+          <w:p>
+            <w:pPr>
+              <w:pStyle w:val="Normal"/>
+              <w:jc w:val="right"/>
+              <w:pBdr>
+                <w:bottom w:val="none" w:sz="0" w:space="0" w:color="000000"/>
+                <w:top w:val="none" w:sz="0" w:space="0" w:color="000000"/>
+                <w:left w:val="none" w:sz="0" w:space="0" w:color="000000"/>
+                <w:right w:val="none" w:sz="0" w:space="0" w:color="000000"/>
+              </w:pBdr>
+              <w:spacing w:after="100" w:before="100" w:line="240"/>
+              <w:ind w:left="100" w:right="100" w:firstLine="0" w:firstLineChars="0"/>
+              <w:rPr>
+                <w:rFonts w:ascii="Arial" w:hAnsi="Arial" w:eastAsia="Arial" w:cs="Arial"/>
+                <w:i w:val="false"/>
+                <w:b w:val="false"/>
+                <w:u w:val="none"/>
+                <w:strike w:val="false"/>
+                <w:sz w:val="22"/>
+                <w:szCs w:val="22"/>
+                <w:color w:val="000000"/>
+              </w:rPr>
+            </w:pPr>
+            <w:r>
+              <w:rPr>
+                <w:rFonts w:ascii="Arial" w:hAnsi="Arial" w:eastAsia="Arial" w:cs="Arial"/>
+                <w:i w:val="false"/>
+                <w:b w:val="false"/>
+                <w:u w:val="none"/>
+                <w:strike w:val="false"/>
+                <w:sz w:val="22"/>
+                <w:szCs w:val="22"/>
+                <w:color w:val="000000"/>
+              </w:rPr>
+              <w:t xml:space="preserve">2.55</w:t>
             </w:r>
           </w:p>
         </w:tc>
@@ -1905,7 +3558,172 @@
                 <w:szCs w:val="22"/>
                 <w:color w:val="000000"/>
               </w:rPr>
+              <w:t xml:space="preserve">5.20</w:t>
+            </w:r>
+          </w:p>
+        </w:tc>
+        <w:tc>
+          <w:tcPr>
+            <w:tcBorders>
+              <w:bottom w:val="single" w:sz="12" w:space="0" w:color="666666"/>
+              <w:top w:val="none" w:sz="0" w:space="0" w:color="000000"/>
+              <w:left w:val="none" w:sz="0" w:space="0" w:color="000000"/>
+              <w:right w:val="none" w:sz="0" w:space="0" w:color="000000"/>
+            </w:tcBorders>
+            <w:shd w:val="clear" w:color="auto" w:fill="FFFFFF"/>
+            <w:tcMar>
+              <w:top w:w="0" w:type="dxa"/>
+              <w:bottom w:w="0" w:type="dxa"/>
+              <w:left w:w="0" w:type="dxa"/>
+              <w:right w:w="0" w:type="dxa"/>
+            </w:tcMar>
+            <w:vAlign w:val="center"/>
+          </w:tcPr>
+          <w:p>
+            <w:pPr>
+              <w:pStyle w:val="Normal"/>
+              <w:jc w:val="right"/>
+              <w:pBdr>
+                <w:bottom w:val="none" w:sz="0" w:space="0" w:color="000000"/>
+                <w:top w:val="none" w:sz="0" w:space="0" w:color="000000"/>
+                <w:left w:val="none" w:sz="0" w:space="0" w:color="000000"/>
+                <w:right w:val="none" w:sz="0" w:space="0" w:color="000000"/>
+              </w:pBdr>
+              <w:spacing w:after="100" w:before="100" w:line="240"/>
+              <w:ind w:left="100" w:right="100" w:firstLine="0" w:firstLineChars="0"/>
+              <w:rPr>
+                <w:rFonts w:ascii="Arial" w:hAnsi="Arial" w:eastAsia="Arial" w:cs="Arial"/>
+                <w:i w:val="false"/>
+                <w:b w:val="false"/>
+                <w:u w:val="none"/>
+                <w:strike w:val="false"/>
+                <w:sz w:val="22"/>
+                <w:szCs w:val="22"/>
+                <w:color w:val="000000"/>
+              </w:rPr>
+            </w:pPr>
+            <w:r>
+              <w:rPr>
+                <w:rFonts w:ascii="Arial" w:hAnsi="Arial" w:eastAsia="Arial" w:cs="Arial"/>
+                <w:i w:val="false"/>
+                <w:b w:val="false"/>
+                <w:u w:val="none"/>
+                <w:strike w:val="false"/>
+                <w:sz w:val="22"/>
+                <w:szCs w:val="22"/>
+                <w:color w:val="000000"/>
+              </w:rPr>
               <w:t xml:space="preserve">12.07</w:t>
+            </w:r>
+          </w:p>
+        </w:tc>
+        <w:tc>
+          <w:tcPr>
+            <w:tcBorders>
+              <w:bottom w:val="single" w:sz="12" w:space="0" w:color="666666"/>
+              <w:top w:val="none" w:sz="0" w:space="0" w:color="000000"/>
+              <w:left w:val="none" w:sz="0" w:space="0" w:color="000000"/>
+              <w:right w:val="none" w:sz="0" w:space="0" w:color="000000"/>
+            </w:tcBorders>
+            <w:shd w:val="clear" w:color="auto" w:fill="FFFFFF"/>
+            <w:tcMar>
+              <w:top w:w="0" w:type="dxa"/>
+              <w:bottom w:w="0" w:type="dxa"/>
+              <w:left w:w="0" w:type="dxa"/>
+              <w:right w:w="0" w:type="dxa"/>
+            </w:tcMar>
+            <w:vAlign w:val="center"/>
+          </w:tcPr>
+          <w:p>
+            <w:pPr>
+              <w:pStyle w:val="Normal"/>
+              <w:jc w:val="right"/>
+              <w:pBdr>
+                <w:bottom w:val="none" w:sz="0" w:space="0" w:color="000000"/>
+                <w:top w:val="none" w:sz="0" w:space="0" w:color="000000"/>
+                <w:left w:val="none" w:sz="0" w:space="0" w:color="000000"/>
+                <w:right w:val="none" w:sz="0" w:space="0" w:color="000000"/>
+              </w:pBdr>
+              <w:spacing w:after="100" w:before="100" w:line="240"/>
+              <w:ind w:left="100" w:right="100" w:firstLine="0" w:firstLineChars="0"/>
+              <w:rPr>
+                <w:rFonts w:ascii="Arial" w:hAnsi="Arial" w:eastAsia="Arial" w:cs="Arial"/>
+                <w:i w:val="false"/>
+                <w:b w:val="false"/>
+                <w:u w:val="none"/>
+                <w:strike w:val="false"/>
+                <w:sz w:val="22"/>
+                <w:szCs w:val="22"/>
+                <w:color w:val="000000"/>
+              </w:rPr>
+            </w:pPr>
+            <w:r>
+              <w:rPr>
+                <w:rFonts w:ascii="Arial" w:hAnsi="Arial" w:eastAsia="Arial" w:cs="Arial"/>
+                <w:i w:val="false"/>
+                <w:b w:val="false"/>
+                <w:u w:val="none"/>
+                <w:strike w:val="false"/>
+                <w:sz w:val="22"/>
+                <w:szCs w:val="22"/>
+                <w:color w:val="000000"/>
+              </w:rPr>
+              <w:t xml:space="preserve">6.53</w:t>
+            </w:r>
+          </w:p>
+        </w:tc>
+        <w:tc>
+          <w:tcPr>
+            <w:tcBorders>
+              <w:bottom w:val="single" w:sz="12" w:space="0" w:color="666666"/>
+              <w:top w:val="none" w:sz="0" w:space="0" w:color="000000"/>
+              <w:left w:val="none" w:sz="0" w:space="0" w:color="000000"/>
+              <w:right w:val="none" w:sz="0" w:space="0" w:color="000000"/>
+            </w:tcBorders>
+            <w:shd w:val="clear" w:color="auto" w:fill="FFFFFF"/>
+            <w:tcMar>
+              <w:top w:w="0" w:type="dxa"/>
+              <w:bottom w:w="0" w:type="dxa"/>
+              <w:left w:w="0" w:type="dxa"/>
+              <w:right w:w="0" w:type="dxa"/>
+            </w:tcMar>
+            <w:vAlign w:val="center"/>
+          </w:tcPr>
+          <w:p>
+            <w:pPr>
+              <w:pStyle w:val="Normal"/>
+              <w:jc w:val="right"/>
+              <w:pBdr>
+                <w:bottom w:val="none" w:sz="0" w:space="0" w:color="000000"/>
+                <w:top w:val="none" w:sz="0" w:space="0" w:color="000000"/>
+                <w:left w:val="none" w:sz="0" w:space="0" w:color="000000"/>
+                <w:right w:val="none" w:sz="0" w:space="0" w:color="000000"/>
+              </w:pBdr>
+              <w:spacing w:after="100" w:before="100" w:line="240"/>
+              <w:ind w:left="100" w:right="100" w:firstLine="0" w:firstLineChars="0"/>
+              <w:rPr>
+                <w:rFonts w:ascii="Arial" w:hAnsi="Arial" w:eastAsia="Arial" w:cs="Arial"/>
+                <w:i w:val="false"/>
+                <w:b w:val="false"/>
+                <w:u w:val="none"/>
+                <w:strike w:val="false"/>
+                <w:sz w:val="22"/>
+                <w:szCs w:val="22"/>
+                <w:color w:val="000000"/>
+              </w:rPr>
+            </w:pPr>
+            <w:r>
+              <w:rPr>
+                <w:rFonts w:ascii="Arial" w:hAnsi="Arial" w:eastAsia="Arial" w:cs="Arial"/>
+                <w:i w:val="false"/>
+                <w:b w:val="false"/>
+                <w:u w:val="none"/>
+                <w:strike w:val="false"/>
+                <w:sz w:val="22"/>
+                <w:szCs w:val="22"/>
+                <w:color w:val="000000"/>
+              </w:rPr>
+              <w:t xml:space="preserve">2.55</w:t>
             </w:r>
           </w:p>
         </w:tc>

</xml_diff>